<commit_message>
made a few additions and changes
</commit_message>
<xml_diff>
--- a/Standard Operating Procedure (SOP) protocols2/0 Master overview.docx
+++ b/Standard Operating Procedure (SOP) protocols2/0 Master overview.docx
@@ -26,6 +26,9 @@
       </w:pPr>
       <w:r>
         <w:t>ABA Analogue Screening Pipeline</w:t>
+      </w:r>
+      <w:r>
+        <w:t xml:space="preserve"> Standard Operating Procedure (SOP)</w:t>
       </w:r>
     </w:p>
     <w:p>
@@ -68,11 +71,6 @@
           <w:bCs/>
         </w:rPr>
         <w:t>Software Requirements &amp; Dependencies</w:t>
-      </w:r>
-    </w:p>
-    <w:p>
-      <w:r>
-        <w:t>List everything the next person needs installed on their machine before they even touch your scripts.</w:t>
       </w:r>
     </w:p>
     <w:p>
@@ -221,7 +219,6 @@
           <w:b/>
           <w:bCs/>
         </w:rPr>
-        <w:lastRenderedPageBreak/>
         <w:t>3. The Pipeline Workflow (Your "Table of Contents")</w:t>
       </w:r>
     </w:p>
@@ -516,207 +513,23 @@
         <w:t>”</w:t>
       </w:r>
     </w:p>
+    <w:p>
+      <w:r>
+        <w:t xml:space="preserve">Visualize </w:t>
+      </w:r>
+      <w:r>
+        <w:t>results</w:t>
+      </w:r>
+      <w:r>
+        <w:t xml:space="preserve"> in ChimeraX: TODO</w:t>
+      </w:r>
+    </w:p>
+    <w:p>
+      <w:r>
+        <w:t>Compile final data into easy visual document: TODO</w:t>
+      </w:r>
+    </w:p>
     <w:p/>
-    <w:p>
-      <w:pPr>
-        <w:numPr>
-          <w:ilvl w:val="0"/>
-          <w:numId w:val="7"/>
-        </w:numPr>
-      </w:pPr>
-      <w:r>
-        <w:rPr>
-          <w:b/>
-          <w:bCs/>
-        </w:rPr>
-        <w:t>Phase 1: Ligand Sourcing &amp; Price Filtering</w:t>
-      </w:r>
-      <w:r>
-        <w:t xml:space="preserve"> * </w:t>
-      </w:r>
-      <w:r>
-        <w:rPr>
-          <w:b/>
-          <w:bCs/>
-        </w:rPr>
-        <w:t>Description:</w:t>
-      </w:r>
-      <w:r>
-        <w:t xml:space="preserve"> Pulling ligand structures from the ZINC database and filtering for cost-efficiency prior to docking.</w:t>
-      </w:r>
-    </w:p>
-    <w:p>
-      <w:pPr>
-        <w:numPr>
-          <w:ilvl w:val="1"/>
-          <w:numId w:val="7"/>
-        </w:numPr>
-      </w:pPr>
-      <w:r>
-        <w:rPr>
-          <w:b/>
-          <w:bCs/>
-        </w:rPr>
-        <w:t>Referenced Document:</w:t>
-      </w:r>
-      <w:r>
-        <w:t xml:space="preserve"> 01_ZINC_Price_Filtering.docx</w:t>
-      </w:r>
-    </w:p>
-    <w:p>
-      <w:pPr>
-        <w:numPr>
-          <w:ilvl w:val="0"/>
-          <w:numId w:val="7"/>
-        </w:numPr>
-      </w:pPr>
-      <w:r>
-        <w:rPr>
-          <w:b/>
-          <w:bCs/>
-        </w:rPr>
-        <w:t>Phase 2: Ligand and Receptor Preparation</w:t>
-      </w:r>
-    </w:p>
-    <w:p>
-      <w:pPr>
-        <w:numPr>
-          <w:ilvl w:val="1"/>
-          <w:numId w:val="7"/>
-        </w:numPr>
-      </w:pPr>
-      <w:r>
-        <w:rPr>
-          <w:b/>
-          <w:bCs/>
-        </w:rPr>
-        <w:t>Description:</w:t>
-      </w:r>
-      <w:r>
-        <w:t xml:space="preserve"> Converting files to the correct formats (like .pdbqt) and setting up the search space/grid box.</w:t>
-      </w:r>
-    </w:p>
-    <w:p>
-      <w:pPr>
-        <w:numPr>
-          <w:ilvl w:val="1"/>
-          <w:numId w:val="7"/>
-        </w:numPr>
-      </w:pPr>
-      <w:r>
-        <w:rPr>
-          <w:b/>
-          <w:bCs/>
-        </w:rPr>
-        <w:t>Referenced Document:</w:t>
-      </w:r>
-      <w:r>
-        <w:t xml:space="preserve"> 02_Preparation_Protocol.docx</w:t>
-      </w:r>
-    </w:p>
-    <w:p>
-      <w:pPr>
-        <w:numPr>
-          <w:ilvl w:val="0"/>
-          <w:numId w:val="7"/>
-        </w:numPr>
-      </w:pPr>
-      <w:r>
-        <w:rPr>
-          <w:b/>
-          <w:bCs/>
-        </w:rPr>
-        <w:t>Phase 3: Docking Execution</w:t>
-      </w:r>
-    </w:p>
-    <w:p>
-      <w:pPr>
-        <w:numPr>
-          <w:ilvl w:val="1"/>
-          <w:numId w:val="7"/>
-        </w:numPr>
-      </w:pPr>
-      <w:r>
-        <w:rPr>
-          <w:b/>
-          <w:bCs/>
-        </w:rPr>
-        <w:t>Description:</w:t>
-      </w:r>
-      <w:r>
-        <w:t xml:space="preserve"> Running the docking simulations using AutoDock Vina.</w:t>
-      </w:r>
-    </w:p>
-    <w:p>
-      <w:pPr>
-        <w:numPr>
-          <w:ilvl w:val="1"/>
-          <w:numId w:val="7"/>
-        </w:numPr>
-      </w:pPr>
-      <w:r>
-        <w:rPr>
-          <w:b/>
-          <w:bCs/>
-        </w:rPr>
-        <w:t>Referenced Document:</w:t>
-      </w:r>
-      <w:r>
-        <w:t xml:space="preserve"> 03_AutoDock_Vina_Execution.docx</w:t>
-      </w:r>
-    </w:p>
-    <w:p>
-      <w:pPr>
-        <w:numPr>
-          <w:ilvl w:val="0"/>
-          <w:numId w:val="7"/>
-        </w:numPr>
-      </w:pPr>
-      <w:r>
-        <w:rPr>
-          <w:b/>
-          <w:bCs/>
-        </w:rPr>
-        <w:t>Phase 4: Output Analysis &amp; Visualization</w:t>
-      </w:r>
-    </w:p>
-    <w:p>
-      <w:pPr>
-        <w:numPr>
-          <w:ilvl w:val="1"/>
-          <w:numId w:val="7"/>
-        </w:numPr>
-      </w:pPr>
-      <w:r>
-        <w:rPr>
-          <w:b/>
-          <w:bCs/>
-        </w:rPr>
-        <w:lastRenderedPageBreak/>
-        <w:t>Description:</w:t>
-      </w:r>
-      <w:r>
-        <w:t xml:space="preserve"> Analyzing binding affinities and viewing the structural poses in ChimeraX.</w:t>
-      </w:r>
-    </w:p>
-    <w:p>
-      <w:pPr>
-        <w:numPr>
-          <w:ilvl w:val="1"/>
-          <w:numId w:val="7"/>
-        </w:numPr>
-      </w:pPr>
-      <w:r>
-        <w:rPr>
-          <w:b/>
-          <w:bCs/>
-        </w:rPr>
-        <w:t>Referenced Document:</w:t>
-      </w:r>
-      <w:r>
-        <w:t xml:space="preserve"> 04_ChimeraX_Analysis.docx</w:t>
-      </w:r>
-    </w:p>
     <w:p>
       <w:pPr>
         <w:rPr>
@@ -803,6 +616,7 @@
     </w:p>
     <w:p>
       <w:r>
+        <w:lastRenderedPageBreak/>
         <w:t xml:space="preserve">Restructuring the pipeline to filter for price </w:t>
       </w:r>
       <w:r>
@@ -842,6 +656,21 @@
           <w:t>J. Chem. Theory Comput. 2021, 10.1021/acs.jctc.0c01006</w:t>
         </w:r>
       </w:hyperlink>
+    </w:p>
+    <w:p>
+      <w:r>
+        <w:t>TODO: ChimeraX</w:t>
+      </w:r>
+    </w:p>
+    <w:p>
+      <w:r>
+        <w:t>TODO: Each of the databases used for price referencing</w:t>
+      </w:r>
+    </w:p>
+    <w:p>
+      <w:r>
+        <w:t>TODO: Zinc Database</w:t>
+      </w:r>
     </w:p>
     <w:p/>
     <w:sectPr>

</xml_diff>